<commit_message>
fix html rendering in markdown
</commit_message>
<xml_diff>
--- a/src/Parchment.Tests/Markdown/MarkdownFlowTests.PropertyContainingMarkdown.verified.docx
+++ b/src/Parchment.Tests/Markdown/MarkdownFlowTests.PropertyContainingMarkdown.verified.docx
@@ -17,8 +17,18 @@
       <w:r>
         <w:t xml:space="preserve">Done</w:t>
       </w:r>
+    </w:p>
+    <w:p>
+      <w:pPr>
+        <w:pStyle w:val="ListParagraph"/>
+        <w:numPr>
+          <w:ilvl w:val="0"/>
+          <w:numId w:val="1"/>
+        </w:numPr>
+        <w:contextualSpacing/>
+      </w:pPr>
       <w:r>
-        <w:t xml:space="preserve">- Landed the </w:t>
+        <w:t xml:space="preserve">Landed the </w:t>
       </w:r>
       <w:r>
         <w:rPr>
@@ -29,8 +39,18 @@
       <w:r>
         <w:t xml:space="preserve"> feature</w:t>
       </w:r>
+    </w:p>
+    <w:p>
+      <w:pPr>
+        <w:pStyle w:val="ListParagraph"/>
+        <w:numPr>
+          <w:ilvl w:val="0"/>
+          <w:numId w:val="1"/>
+        </w:numPr>
+        <w:contextualSpacing/>
+      </w:pPr>
       <w:r>
-        <w:t xml:space="preserve">- Fixed </w:t>
+        <w:t xml:space="preserve">Fixed </w:t>
       </w:r>
       <w:r>
         <w:rPr>
@@ -41,8 +61,13 @@
       <w:r>
         <w:t xml:space="preserve"> regressions</w:t>
       </w:r>
+    </w:p>
+    <w:p>
+      <w:pPr>
+        <w:pStyle w:val="Quote"/>
+      </w:pPr>
       <w:r>
-        <w:t xml:space="preserve"> Ship it.</w:t>
+        <w:t xml:space="preserve">Ship it.</w:t>
       </w:r>
     </w:p>
     <w:sectPr>
@@ -57,6 +82,49 @@
     </w:sectPr>
   </w:body>
 </w:document>
+</file>
+
+<file path=word/numbering.xml><?xml version="1.0" encoding="utf-8"?>
+<numbering xmlns="http://schemas.openxmlformats.org/wordprocessingml/2006/main">
+  <abstractNum xmlns:p2="http://schemas.openxmlformats.org/wordprocessingml/2006/main" p2:abstractNumId="0">
+    <p2:lvl p2:ilvl="0">
+      <p2:numFmt p2:val="bullet"/>
+      <p2:lvlText p2:val=""/>
+      <p2:lvlJc p2:val="left"/>
+      <p2:pPr>
+        <p2:ind p2:left="480" p2:hanging="240"/>
+      </p2:pPr>
+      <p2:rPr>
+        <p2:rFonts p2:hint="default" p2:ascii="Symbol" p2:hAnsi="Symbol"/>
+      </p2:rPr>
+    </p2:lvl>
+    <p2:lvl p2:ilvl="1">
+      <p2:numFmt p2:val="bullet"/>
+      <p2:lvlText p2:val="o"/>
+      <p2:lvlJc p2:val="left"/>
+      <p2:pPr>
+        <p2:ind p2:left="960" p2:hanging="240"/>
+      </p2:pPr>
+      <p2:rPr>
+        <p2:rFonts p2:hint="default" p2:ascii="Courier New" p2:hAnsi="Courier New"/>
+      </p2:rPr>
+    </p2:lvl>
+    <p2:lvl p2:ilvl="2">
+      <p2:numFmt p2:val="bullet"/>
+      <p2:lvlText p2:val=""/>
+      <p2:lvlJc p2:val="left"/>
+      <p2:pPr>
+        <p2:ind p2:left="1440" p2:hanging="240"/>
+      </p2:pPr>
+      <p2:rPr>
+        <p2:rFonts p2:hint="default" p2:ascii="Wingdings" p2:hAnsi="Wingdings"/>
+      </p2:rPr>
+    </p2:lvl>
+  </abstractNum>
+  <num xmlns:p2="http://schemas.openxmlformats.org/wordprocessingml/2006/main" p2:numId="1">
+    <p2:abstractNumId p2:val="0"/>
+  </num>
+</numbering>
 </file>
 
 <file path=word/styles.xml><?xml version="1.0" encoding="utf-8"?>

</xml_diff>

<commit_message>
Fix html rendering in markdown (#18)
* fix html rendering in markdown

* Update ScopeTreeRunner.cs
</commit_message>
<xml_diff>
--- a/src/Parchment.Tests/Markdown/MarkdownFlowTests.PropertyContainingMarkdown.verified.docx
+++ b/src/Parchment.Tests/Markdown/MarkdownFlowTests.PropertyContainingMarkdown.verified.docx
@@ -17,8 +17,18 @@
       <w:r>
         <w:t xml:space="preserve">Done</w:t>
       </w:r>
+    </w:p>
+    <w:p>
+      <w:pPr>
+        <w:pStyle w:val="ListParagraph"/>
+        <w:numPr>
+          <w:ilvl w:val="0"/>
+          <w:numId w:val="1"/>
+        </w:numPr>
+        <w:contextualSpacing/>
+      </w:pPr>
       <w:r>
-        <w:t xml:space="preserve">- Landed the </w:t>
+        <w:t xml:space="preserve">Landed the </w:t>
       </w:r>
       <w:r>
         <w:rPr>
@@ -29,8 +39,18 @@
       <w:r>
         <w:t xml:space="preserve"> feature</w:t>
       </w:r>
+    </w:p>
+    <w:p>
+      <w:pPr>
+        <w:pStyle w:val="ListParagraph"/>
+        <w:numPr>
+          <w:ilvl w:val="0"/>
+          <w:numId w:val="1"/>
+        </w:numPr>
+        <w:contextualSpacing/>
+      </w:pPr>
       <w:r>
-        <w:t xml:space="preserve">- Fixed </w:t>
+        <w:t xml:space="preserve">Fixed </w:t>
       </w:r>
       <w:r>
         <w:rPr>
@@ -41,8 +61,13 @@
       <w:r>
         <w:t xml:space="preserve"> regressions</w:t>
       </w:r>
+    </w:p>
+    <w:p>
+      <w:pPr>
+        <w:pStyle w:val="Quote"/>
+      </w:pPr>
       <w:r>
-        <w:t xml:space="preserve"> Ship it.</w:t>
+        <w:t xml:space="preserve">Ship it.</w:t>
       </w:r>
     </w:p>
     <w:sectPr>
@@ -57,6 +82,49 @@
     </w:sectPr>
   </w:body>
 </w:document>
+</file>
+
+<file path=word/numbering.xml><?xml version="1.0" encoding="utf-8"?>
+<numbering xmlns="http://schemas.openxmlformats.org/wordprocessingml/2006/main">
+  <abstractNum xmlns:p2="http://schemas.openxmlformats.org/wordprocessingml/2006/main" p2:abstractNumId="0">
+    <p2:lvl p2:ilvl="0">
+      <p2:numFmt p2:val="bullet"/>
+      <p2:lvlText p2:val=""/>
+      <p2:lvlJc p2:val="left"/>
+      <p2:pPr>
+        <p2:ind p2:left="480" p2:hanging="240"/>
+      </p2:pPr>
+      <p2:rPr>
+        <p2:rFonts p2:hint="default" p2:ascii="Symbol" p2:hAnsi="Symbol"/>
+      </p2:rPr>
+    </p2:lvl>
+    <p2:lvl p2:ilvl="1">
+      <p2:numFmt p2:val="bullet"/>
+      <p2:lvlText p2:val="o"/>
+      <p2:lvlJc p2:val="left"/>
+      <p2:pPr>
+        <p2:ind p2:left="960" p2:hanging="240"/>
+      </p2:pPr>
+      <p2:rPr>
+        <p2:rFonts p2:hint="default" p2:ascii="Courier New" p2:hAnsi="Courier New"/>
+      </p2:rPr>
+    </p2:lvl>
+    <p2:lvl p2:ilvl="2">
+      <p2:numFmt p2:val="bullet"/>
+      <p2:lvlText p2:val=""/>
+      <p2:lvlJc p2:val="left"/>
+      <p2:pPr>
+        <p2:ind p2:left="1440" p2:hanging="240"/>
+      </p2:pPr>
+      <p2:rPr>
+        <p2:rFonts p2:hint="default" p2:ascii="Wingdings" p2:hAnsi="Wingdings"/>
+      </p2:rPr>
+    </p2:lvl>
+  </abstractNum>
+  <num xmlns:p2="http://schemas.openxmlformats.org/wordprocessingml/2006/main" p2:numId="1">
+    <p2:abstractNumId p2:val="0"/>
+  </num>
+</numbering>
 </file>
 
 <file path=word/styles.xml><?xml version="1.0" encoding="utf-8"?>

</xml_diff>